<commit_message>
Sorting Paper published and major changes in Research page
</commit_message>
<xml_diff>
--- a/documents/CV_Hirayama.docx
+++ b/documents/CV_Hirayama.docx
@@ -45,15 +45,60 @@
         <w:pStyle w:val="Info"/>
       </w:pPr>
       <w:r>
-        <w:t xml:space="preserve">Co-Founder of </w:t>
-      </w:r>
-      <w:proofErr w:type="spellStart"/>
+        <w:t>Co-Founder of AcoustoFab LTD</w:t>
+      </w:r>
+    </w:p>
+    <w:p>
+      <w:pPr>
+        <w:pStyle w:val="Info"/>
+      </w:pPr>
+      <w:r>
+        <w:t>Honorary Professor at Chiba University, Japan</w:t>
+      </w:r>
+    </w:p>
+    <w:p>
+      <w:pPr>
+        <w:pStyle w:val="Info"/>
+      </w:pPr>
+      <w:r>
+        <w:t xml:space="preserve">UCL </w:t>
+      </w:r>
+      <w:r>
+        <w:t>Email: r.hirayama@ucl.ac.uk</w:t>
+      </w:r>
+    </w:p>
+    <w:p>
+      <w:pPr>
+        <w:pStyle w:val="Info"/>
+      </w:pPr>
+      <w:r>
+        <w:t xml:space="preserve">UCL </w:t>
+      </w:r>
+      <w:r>
+        <w:t>Address: 169 Euston Road, London NW1 2AE, UK</w:t>
+      </w:r>
+    </w:p>
+    <w:p>
+      <w:pPr>
+        <w:pStyle w:val="Info"/>
+      </w:pPr>
       <w:r>
         <w:t>AcoustoFab</w:t>
       </w:r>
-      <w:proofErr w:type="spellEnd"/>
-      <w:r>
-        <w:t xml:space="preserve"> LTD</w:t>
+      <w:r>
+        <w:t xml:space="preserve"> </w:t>
+      </w:r>
+      <w:r>
+        <w:t xml:space="preserve">Email: </w:t>
+      </w:r>
+      <w:r>
+        <w:t>ryuji</w:t>
+      </w:r>
+      <w:r>
+        <w:t>@</w:t>
+      </w:r>
+      <w:r>
+        <w:t>acoustofab.co.uk</w:t>
       </w:r>
     </w:p>
     <w:p>
@@ -61,95 +106,250 @@
         <w:pStyle w:val="Info"/>
       </w:pPr>
       <w:r>
-        <w:t xml:space="preserve">Address: </w:t>
-      </w:r>
-      <w:r>
-        <w:t>169 Euston Road</w:t>
+        <w:t xml:space="preserve">AcoustoFab Address: </w:t>
+      </w:r>
+      <w:r>
+        <w:t>Unit 108, E1 Studios, Whitechapel Road, London E1 1DU, UK</w:t>
+      </w:r>
+    </w:p>
+    <w:p>
+      <w:pPr>
+        <w:pStyle w:val="Info"/>
+      </w:pPr>
+      <w:r>
+        <w:t>Web</w:t>
+      </w:r>
+      <w:r>
+        <w:t>site</w:t>
+      </w:r>
+      <w:r>
+        <w:t xml:space="preserve">: </w:t>
+      </w:r>
+      <w:r>
+        <w:t>https://ryujihirayama.github.io/web/</w:t>
+      </w:r>
+      <w:r>
+        <w:t xml:space="preserve"> </w:t>
+      </w:r>
+    </w:p>
+    <w:p>
+      <w:pPr>
+        <w:pStyle w:val="Heading1"/>
+      </w:pPr>
+      <w:r>
+        <w:t>Research Interests</w:t>
+      </w:r>
+    </w:p>
+    <w:p>
+      <w:r>
+        <w:t xml:space="preserve">Volumetric display, Holography, High-performance computing, Acoustic levitation, </w:t>
+      </w:r>
+      <w:r>
+        <w:t xml:space="preserve">Multimodal system, </w:t>
+      </w:r>
+      <w:r>
+        <w:t>Haptics, Parametric audio, Human-computer interaction</w:t>
+      </w:r>
+      <w:r>
+        <w:t>, 3D Ambigram</w:t>
+      </w:r>
+      <w:r>
+        <w:t>, Computational fabrication</w:t>
+      </w:r>
+      <w:r>
+        <w:t>, Contactless material handling</w:t>
+      </w:r>
+    </w:p>
+    <w:p>
+      <w:pPr>
+        <w:pStyle w:val="Heading1"/>
+      </w:pPr>
+      <w:r>
+        <w:t>Education</w:t>
+      </w:r>
+    </w:p>
+    <w:p>
+      <w:pPr>
+        <w:pStyle w:val="DateList1"/>
+      </w:pPr>
+      <w:r>
+        <w:t>03/</w:t>
+      </w:r>
+      <w:r>
+        <w:t>2014–</w:t>
+      </w:r>
+      <w:r>
+        <w:t>04/</w:t>
+      </w:r>
+      <w:r>
+        <w:t>2017</w:t>
+      </w:r>
+      <w:r>
+        <w:tab/>
+      </w:r>
+      <w:r>
+        <w:rPr>
+          <w:b/>
+          <w:bCs/>
+        </w:rPr>
+        <w:t>PhD in Engineering</w:t>
+      </w:r>
+    </w:p>
+    <w:p>
+      <w:pPr>
+        <w:pStyle w:val="DateList2"/>
+      </w:pPr>
+      <w:r>
+        <w:t>Graduate School of Engineering, Chiba University, Japan</w:t>
+      </w:r>
+    </w:p>
+    <w:p>
+      <w:pPr>
+        <w:pStyle w:val="DateList2"/>
+      </w:pPr>
+      <w:r>
+        <w:t>Theme: Volumetric display containing multiple 2D images</w:t>
+      </w:r>
+    </w:p>
+    <w:p>
+      <w:pPr>
+        <w:pStyle w:val="DateList1"/>
+      </w:pPr>
+      <w:r>
+        <w:t>03/</w:t>
+      </w:r>
+      <w:r>
+        <w:t>2012</w:t>
+      </w:r>
+      <w:r>
+        <w:t>.</w:t>
+      </w:r>
+      <w:r>
+        <w:t>–</w:t>
+      </w:r>
+      <w:r>
+        <w:t>04/</w:t>
+      </w:r>
+      <w:r>
+        <w:t>2014</w:t>
+      </w:r>
+      <w:r>
+        <w:tab/>
+      </w:r>
+      <w:r>
+        <w:rPr>
+          <w:b/>
+          <w:bCs/>
+        </w:rPr>
+        <w:t>Master of Engineering</w:t>
+      </w:r>
+    </w:p>
+    <w:p>
+      <w:pPr>
+        <w:pStyle w:val="DateList2"/>
+      </w:pPr>
+      <w:r>
+        <w:t>Graduate School of Engineering, Chiba University, Japan</w:t>
+      </w:r>
+    </w:p>
+    <w:p>
+      <w:pPr>
+        <w:pStyle w:val="DateList1"/>
+        <w:rPr>
+          <w:b/>
+          <w:bCs/>
+        </w:rPr>
+      </w:pPr>
+      <w:r>
+        <w:t>03/</w:t>
+      </w:r>
+      <w:r>
+        <w:t>2008–</w:t>
+      </w:r>
+      <w:r>
+        <w:t>04/</w:t>
+      </w:r>
+      <w:r>
+        <w:t>2012</w:t>
+      </w:r>
+      <w:r>
+        <w:tab/>
+      </w:r>
+      <w:r>
+        <w:rPr>
+          <w:b/>
+          <w:bCs/>
+        </w:rPr>
+        <w:t>Bachelor of Engineering</w:t>
+      </w:r>
+    </w:p>
+    <w:p>
+      <w:pPr>
+        <w:pStyle w:val="DateList2"/>
+      </w:pPr>
+      <w:r>
+        <w:t xml:space="preserve">Faculty of Engineering, </w:t>
+      </w:r>
+      <w:r>
+        <w:t>Chiba</w:t>
+      </w:r>
+      <w:r>
+        <w:t xml:space="preserve"> University, Japan</w:t>
+      </w:r>
+    </w:p>
+    <w:p>
+      <w:pPr>
+        <w:pStyle w:val="Heading1"/>
+      </w:pPr>
+      <w:r>
+        <w:t>Experience</w:t>
+      </w:r>
+    </w:p>
+    <w:p>
+      <w:pPr>
+        <w:pStyle w:val="DateList1"/>
+      </w:pPr>
+      <w:r>
+        <w:t>07</w:t>
+      </w:r>
+      <w:r>
+        <w:t>/</w:t>
+      </w:r>
+      <w:r>
+        <w:t>20</w:t>
+      </w:r>
+      <w:r>
+        <w:t>2</w:t>
+      </w:r>
+      <w:r>
+        <w:t>5</w:t>
+      </w:r>
+      <w:r>
+        <w:t>–present</w:t>
+      </w:r>
+      <w:r>
+        <w:tab/>
+      </w:r>
+      <w:r>
+        <w:rPr>
+          <w:b/>
+          <w:bCs/>
+        </w:rPr>
+        <w:t>Honorary Professor</w:t>
+      </w:r>
+    </w:p>
+    <w:p>
+      <w:pPr>
+        <w:pStyle w:val="DateList2"/>
+      </w:pPr>
+      <w:r>
+        <w:t>Chiba University</w:t>
       </w:r>
       <w:r>
         <w:t xml:space="preserve">, </w:t>
       </w:r>
       <w:r>
-        <w:t>London</w:t>
-      </w:r>
-      <w:r>
-        <w:t xml:space="preserve"> </w:t>
-      </w:r>
-      <w:r>
-        <w:t>NW1 2AE,</w:t>
-      </w:r>
-      <w:r>
-        <w:t xml:space="preserve"> UK</w:t>
-      </w:r>
-    </w:p>
-    <w:p>
-      <w:pPr>
-        <w:pStyle w:val="Info"/>
-      </w:pPr>
-      <w:r>
-        <w:t xml:space="preserve">Email: </w:t>
-      </w:r>
-      <w:r>
-        <w:t>r</w:t>
-      </w:r>
-      <w:r>
-        <w:t>.</w:t>
-      </w:r>
-      <w:r>
-        <w:t>hirayama@</w:t>
-      </w:r>
-      <w:r>
-        <w:t>ucl</w:t>
-      </w:r>
-      <w:r>
-        <w:t>.ac.uk</w:t>
-      </w:r>
-    </w:p>
-    <w:p>
-      <w:pPr>
-        <w:pStyle w:val="Info"/>
-      </w:pPr>
-      <w:r>
-        <w:t xml:space="preserve">Web: </w:t>
-      </w:r>
-      <w:r>
-        <w:t>https://ryujihirayama.github.io/web/</w:t>
-      </w:r>
-      <w:r>
-        <w:t xml:space="preserve"> </w:t>
-      </w:r>
-    </w:p>
-    <w:p>
-      <w:pPr>
-        <w:pStyle w:val="Heading1"/>
-      </w:pPr>
-      <w:r>
-        <w:t>Research Interests</w:t>
-      </w:r>
-    </w:p>
-    <w:p>
-      <w:r>
-        <w:t xml:space="preserve">Volumetric display, Holography, High-performance computing, Acoustic levitation, </w:t>
-      </w:r>
-      <w:r>
-        <w:t xml:space="preserve">Multimodal system, </w:t>
-      </w:r>
-      <w:r>
-        <w:t>Haptics, Parametric audio, Human-computer interaction</w:t>
-      </w:r>
-      <w:r>
-        <w:t>, 3D Ambigram</w:t>
-      </w:r>
-      <w:r>
-        <w:t>, Computational fabrication</w:t>
-      </w:r>
-    </w:p>
-    <w:p>
-      <w:pPr>
-        <w:pStyle w:val="Heading1"/>
-      </w:pPr>
-      <w:r>
-        <w:t>Education</w:t>
+        <w:t>Japan</w:t>
       </w:r>
     </w:p>
     <w:p>
@@ -157,16 +357,16 @@
         <w:pStyle w:val="DateList1"/>
       </w:pPr>
       <w:r>
-        <w:t>03/</w:t>
-      </w:r>
-      <w:r>
-        <w:t>2014–</w:t>
-      </w:r>
-      <w:r>
-        <w:t>04/</w:t>
-      </w:r>
-      <w:r>
-        <w:t>2017</w:t>
+        <w:t>10/</w:t>
+      </w:r>
+      <w:r>
+        <w:t>20</w:t>
+      </w:r>
+      <w:r>
+        <w:t>23</w:t>
+      </w:r>
+      <w:r>
+        <w:t>–present</w:t>
       </w:r>
       <w:r>
         <w:tab/>
@@ -176,7 +376,7 @@
           <w:b/>
           <w:bCs/>
         </w:rPr>
-        <w:t>PhD in Engineering</w:t>
+        <w:t>Co-Founder/Hardware Lead</w:t>
       </w:r>
     </w:p>
     <w:p>
@@ -184,155 +384,7 @@
         <w:pStyle w:val="DateList2"/>
       </w:pPr>
       <w:r>
-        <w:t>Graduate School of Engineering, Chiba University, Japan</w:t>
-      </w:r>
-    </w:p>
-    <w:p>
-      <w:pPr>
-        <w:pStyle w:val="DateList2"/>
-      </w:pPr>
-      <w:r>
-        <w:t>Theme: Volumetric display containing multiple 2D images</w:t>
-      </w:r>
-    </w:p>
-    <w:p>
-      <w:pPr>
-        <w:pStyle w:val="DateList1"/>
-      </w:pPr>
-      <w:r>
-        <w:t>03/</w:t>
-      </w:r>
-      <w:r>
-        <w:t>2012</w:t>
-      </w:r>
-      <w:r>
-        <w:t>.</w:t>
-      </w:r>
-      <w:r>
-        <w:t>–</w:t>
-      </w:r>
-      <w:r>
-        <w:t>04/</w:t>
-      </w:r>
-      <w:r>
-        <w:t>2014</w:t>
-      </w:r>
-      <w:r>
-        <w:tab/>
-      </w:r>
-      <w:r>
-        <w:rPr>
-          <w:b/>
-          <w:bCs/>
-        </w:rPr>
-        <w:t>Master of Engineering</w:t>
-      </w:r>
-    </w:p>
-    <w:p>
-      <w:pPr>
-        <w:pStyle w:val="DateList2"/>
-      </w:pPr>
-      <w:r>
-        <w:t>Graduate School of Engineering, Chiba University, Japan</w:t>
-      </w:r>
-    </w:p>
-    <w:p>
-      <w:pPr>
-        <w:pStyle w:val="DateList1"/>
-        <w:rPr>
-          <w:b/>
-          <w:bCs/>
-        </w:rPr>
-      </w:pPr>
-      <w:r>
-        <w:t>03/</w:t>
-      </w:r>
-      <w:r>
-        <w:t>2008–</w:t>
-      </w:r>
-      <w:r>
-        <w:t>04/</w:t>
-      </w:r>
-      <w:r>
-        <w:t>2012</w:t>
-      </w:r>
-      <w:r>
-        <w:tab/>
-      </w:r>
-      <w:r>
-        <w:rPr>
-          <w:b/>
-          <w:bCs/>
-        </w:rPr>
-        <w:t>Bachelor of Engineering</w:t>
-      </w:r>
-    </w:p>
-    <w:p>
-      <w:pPr>
-        <w:pStyle w:val="DateList2"/>
-      </w:pPr>
-      <w:r>
-        <w:t xml:space="preserve">Faculty of Engineering, </w:t>
-      </w:r>
-      <w:r>
-        <w:t>Chiba</w:t>
-      </w:r>
-      <w:r>
-        <w:t xml:space="preserve"> University, Japan</w:t>
-      </w:r>
-    </w:p>
-    <w:p>
-      <w:pPr>
-        <w:pStyle w:val="Heading1"/>
-      </w:pPr>
-      <w:r>
-        <w:t>Experience</w:t>
-      </w:r>
-    </w:p>
-    <w:p>
-      <w:pPr>
-        <w:pStyle w:val="DateList1"/>
-      </w:pPr>
-      <w:r>
-        <w:t>10</w:t>
-      </w:r>
-      <w:r>
-        <w:t>/</w:t>
-      </w:r>
-      <w:r>
-        <w:t>20</w:t>
-      </w:r>
-      <w:r>
-        <w:t>2</w:t>
-      </w:r>
-      <w:r>
-        <w:t>3</w:t>
-      </w:r>
-      <w:r>
-        <w:t>–present</w:t>
-      </w:r>
-      <w:r>
-        <w:tab/>
-      </w:r>
-      <w:r>
-        <w:rPr>
-          <w:b/>
-          <w:bCs/>
-        </w:rPr>
-        <w:t>Co-Founder/Hardware Lead</w:t>
-      </w:r>
-    </w:p>
-    <w:p>
-      <w:pPr>
-        <w:pStyle w:val="DateList2"/>
-      </w:pPr>
-      <w:proofErr w:type="spellStart"/>
-      <w:r>
-        <w:t>AcoustoFab</w:t>
-      </w:r>
-      <w:proofErr w:type="spellEnd"/>
-      <w:r>
-        <w:t xml:space="preserve"> LTD</w:t>
+        <w:t>AcoustoFab LTD</w:t>
       </w:r>
       <w:r>
         <w:t>, UK</w:t>
@@ -846,7 +898,22 @@
         <w:t xml:space="preserve"> Conveyor Belts</w:t>
       </w:r>
       <w:r>
-        <w:t>,’ Nature Communications (accepted).</w:t>
+        <w:t xml:space="preserve">,’ Nature </w:t>
+      </w:r>
+      <w:r>
+        <w:t>Communications 16, 6975</w:t>
+      </w:r>
+      <w:r>
+        <w:t xml:space="preserve"> </w:t>
+      </w:r>
+      <w:r>
+        <w:t>(</w:t>
+      </w:r>
+      <w:r>
+        <w:t>2025</w:t>
+      </w:r>
+      <w:r>
+        <w:t>).</w:t>
       </w:r>
     </w:p>
     <w:p>
@@ -994,6 +1061,7 @@
         </w:numPr>
       </w:pPr>
       <w:r>
+        <w:lastRenderedPageBreak/>
         <w:t>A.</w:t>
       </w:r>
       <w:r>
@@ -1050,7 +1118,13 @@
       </w:r>
       <w:proofErr w:type="spellEnd"/>
       <w:r>
-        <w:t>’, Advanced Functional Materials 2502899 (2025).</w:t>
+        <w:t>’, Advanced Functional Materials 2502899 (2025)</w:t>
+      </w:r>
+      <w:r>
+        <w:t>, featured on the front cover</w:t>
+      </w:r>
+      <w:r>
+        <w:t>.</w:t>
       </w:r>
     </w:p>
     <w:p>
@@ -1130,7 +1204,6 @@
         </w:numPr>
       </w:pPr>
       <w:r>
-        <w:lastRenderedPageBreak/>
         <w:t>H</w:t>
       </w:r>
       <w:r>
@@ -1198,7 +1271,13 @@
       </w:r>
       <w:proofErr w:type="gramEnd"/>
       <w:r>
-        <w:t xml:space="preserve"> Situ 3D Printing Using Acoustic Levitation’, Advanced Materials Technologies 2401792 (2024) featured on the back cover.</w:t>
+        <w:t xml:space="preserve"> Situ 3D Printing Using Acoustic Levitation’, Advanced Materials Technologies 2401792 (2024)</w:t>
+      </w:r>
+      <w:r>
+        <w:t>,</w:t>
+      </w:r>
+      <w:r>
+        <w:t xml:space="preserve"> featured on the back cover.</w:t>
       </w:r>
     </w:p>
     <w:p>
@@ -2053,7 +2132,13 @@
         <w:t>1</w:t>
       </w:r>
       <w:r>
-        <w:t>, 254–259 (2018).</w:t>
+        <w:t>, 254–259 (2018)</w:t>
+      </w:r>
+      <w:r>
+        <w:t>, featured on the front cover</w:t>
+      </w:r>
+      <w:r>
+        <w:t>.</w:t>
       </w:r>
     </w:p>
     <w:p>
@@ -2985,6 +3070,7 @@
         </w:numPr>
       </w:pPr>
       <w:r>
+        <w:lastRenderedPageBreak/>
         <w:t xml:space="preserve">T. </w:t>
       </w:r>
       <w:proofErr w:type="spellStart"/>
@@ -3134,7 +3220,6 @@
         </w:numPr>
       </w:pPr>
       <w:r>
-        <w:lastRenderedPageBreak/>
         <w:t xml:space="preserve">D. Arai, T. </w:t>
       </w:r>
       <w:proofErr w:type="spellStart"/>
@@ -3660,16 +3745,137 @@
         <w:pStyle w:val="ListParagraph"/>
       </w:pPr>
       <w:r>
+        <w:t xml:space="preserve">(invited) </w:t>
+      </w:r>
+      <w:r>
+        <w:t>H.</w:t>
+      </w:r>
+      <w:r>
+        <w:t xml:space="preserve"> Chen, </w:t>
+      </w:r>
+      <w:r>
+        <w:t>S.</w:t>
+      </w:r>
+      <w:r>
+        <w:t xml:space="preserve"> Bansal, </w:t>
+      </w:r>
+      <w:r>
+        <w:t>D.</w:t>
+      </w:r>
+      <w:r>
+        <w:t xml:space="preserve"> </w:t>
+      </w:r>
+      <w:r>
+        <w:t>M.</w:t>
+      </w:r>
+      <w:r>
+        <w:t xml:space="preserve"> Plasencia, </w:t>
+      </w:r>
+      <w:r>
+        <w:t>L.</w:t>
+      </w:r>
+      <w:r>
+        <w:t xml:space="preserve"> Di-Silvio, </w:t>
+      </w:r>
+      <w:r>
         <w:t>J.</w:t>
       </w:r>
       <w:r>
-        <w:t xml:space="preserve"> Mukherjee, </w:t>
-      </w:r>
-      <w:r>
-        <w:t>Z.</w:t>
-      </w:r>
-      <w:r>
-        <w:t xml:space="preserve"> Shen, </w:t>
+        <w:t xml:space="preserve"> Huang, </w:t>
+      </w:r>
+      <w:r>
+        <w:t>S.</w:t>
+      </w:r>
+      <w:r>
+        <w:t xml:space="preserve"> Subramanian, and </w:t>
+      </w:r>
+      <w:r>
+        <w:rPr>
+          <w:b/>
+          <w:bCs w:val="0"/>
+        </w:rPr>
+        <w:t>R.</w:t>
+      </w:r>
+      <w:r>
+        <w:rPr>
+          <w:b/>
+          <w:bCs w:val="0"/>
+        </w:rPr>
+        <w:t xml:space="preserve"> Hirayama</w:t>
+      </w:r>
+      <w:r>
+        <w:t xml:space="preserve">, ‘Acoustic Levitation for Omnidirectional and Multi-Material </w:t>
+      </w:r>
+      <w:proofErr w:type="gramStart"/>
+      <w:r>
+        <w:t>In</w:t>
+      </w:r>
+      <w:proofErr w:type="gramEnd"/>
+      <w:r>
+        <w:t xml:space="preserve"> Situ Printing’, 1st International Conference on Future of AM 2025, Singapore (08/2025).</w:t>
+      </w:r>
+    </w:p>
+    <w:p>
+      <w:pPr>
+        <w:pStyle w:val="ListParagraph"/>
+      </w:pPr>
+      <w:r>
+        <w:t xml:space="preserve">J. Mukherjee, Z. Shen, G. Christopoulos, S. Subramanian, and </w:t>
+      </w:r>
+      <w:r>
+        <w:rPr>
+          <w:b/>
+          <w:bCs w:val="0"/>
+        </w:rPr>
+        <w:t>R. Hirayama</w:t>
+      </w:r>
+      <w:r>
+        <w:t xml:space="preserve">, ‘To BEM or not to </w:t>
+      </w:r>
+      <w:proofErr w:type="gramStart"/>
+      <w:r>
+        <w:t>BEM?:</w:t>
+      </w:r>
+      <w:proofErr w:type="gramEnd"/>
+      <w:r>
+        <w:t xml:space="preserve"> Does Modelling Sound Scattering Improve Ultrasonic Mid-Air Haptics?’, CHI 2025 (Late Breaking Work), Yokohama, Japan (04/2025).</w:t>
+      </w:r>
+    </w:p>
+    <w:p>
+      <w:pPr>
+        <w:pStyle w:val="ListParagraph"/>
+      </w:pPr>
+      <w:r>
+        <w:t xml:space="preserve">G. Christopoulos, L. Gao, D. M. Plasencia, M. </w:t>
+      </w:r>
+      <w:proofErr w:type="spellStart"/>
+      <w:r>
+        <w:t>Betcke</w:t>
+      </w:r>
+      <w:proofErr w:type="spellEnd"/>
+      <w:r>
+        <w:t xml:space="preserve">, </w:t>
+      </w:r>
+      <w:r>
+        <w:rPr>
+          <w:b/>
+          <w:bCs w:val="0"/>
+        </w:rPr>
+        <w:t>R. Hirayama</w:t>
+      </w:r>
+      <w:r>
+        <w:t>, and S. Subramanian, ‘Temporal acoustic point holography’, SIGGRAPH 2024 (Conference Papers), Denver, USA (07/2024).</w:t>
+      </w:r>
+    </w:p>
+    <w:p>
+      <w:pPr>
+        <w:pStyle w:val="ListParagraph"/>
+      </w:pPr>
+      <w:r>
+        <w:t>L.</w:t>
+      </w:r>
+      <w:r>
+        <w:t xml:space="preserve"> Gao, </w:t>
       </w:r>
       <w:r>
         <w:t>G.</w:t>
@@ -3678,566 +3884,772 @@
         <w:t xml:space="preserve"> Christopoulos, </w:t>
       </w:r>
       <w:r>
+        <w:t>P.</w:t>
+      </w:r>
+      <w:r>
+        <w:t xml:space="preserve"> Mittal, </w:t>
+      </w:r>
+      <w:r>
+        <w:t>R.</w:t>
+      </w:r>
+      <w:r>
+        <w:t xml:space="preserve"> Hirayama, and </w:t>
+      </w:r>
+      <w:r>
         <w:t>S.</w:t>
       </w:r>
       <w:r>
-        <w:t xml:space="preserve"> Subramanian, and </w:t>
-      </w:r>
+        <w:t xml:space="preserve"> Subramanian, ‘</w:t>
+      </w:r>
+      <w:proofErr w:type="spellStart"/>
+      <w:r>
+        <w:t>StableLev</w:t>
+      </w:r>
+      <w:proofErr w:type="spellEnd"/>
+      <w:r>
+        <w:t>: Data-driven stability enhancement for multi-particle acoustic levitation’, CHI 2024 (Paper), Hawaii, USA (05/2024).</w:t>
+      </w:r>
+    </w:p>
+    <w:p>
+      <w:pPr>
+        <w:pStyle w:val="ListParagraph"/>
+      </w:pPr>
+      <w:r>
+        <w:t>L. Gao, P. Irani, S. Subramanian, G Prabhakar, D. M. Plasencia</w:t>
+      </w:r>
+      <w:r>
+        <w:t>,</w:t>
+      </w:r>
+      <w:r>
+        <w:t xml:space="preserve"> and</w:t>
+      </w:r>
+      <w:r>
+        <w:rPr>
+          <w:b/>
+        </w:rPr>
+        <w:t xml:space="preserve"> R</w:t>
+      </w:r>
+      <w:r>
+        <w:rPr>
+          <w:b/>
+        </w:rPr>
+        <w:t>.</w:t>
+      </w:r>
+      <w:r>
+        <w:rPr>
+          <w:b/>
+        </w:rPr>
+        <w:t xml:space="preserve"> Hirayama</w:t>
+      </w:r>
+      <w:r>
+        <w:t>, ‘</w:t>
+      </w:r>
+      <w:proofErr w:type="spellStart"/>
+      <w:r>
+        <w:t>DataLev</w:t>
+      </w:r>
+      <w:proofErr w:type="spellEnd"/>
+      <w:r>
+        <w:t xml:space="preserve">: Mid-air data </w:t>
+      </w:r>
+      <w:proofErr w:type="spellStart"/>
+      <w:r>
+        <w:t>physicalisation</w:t>
+      </w:r>
+      <w:proofErr w:type="spellEnd"/>
+      <w:r>
+        <w:t xml:space="preserve"> using acoustic levitation</w:t>
+      </w:r>
+      <w:r>
+        <w:t>’, CHI 2023, Hamburg, Germany (04/2023).</w:t>
+      </w:r>
+    </w:p>
+    <w:p>
+      <w:pPr>
+        <w:pStyle w:val="ListParagraph"/>
+      </w:pPr>
       <w:r>
         <w:rPr>
           <w:b/>
           <w:bCs w:val="0"/>
         </w:rPr>
-        <w:t>R.</w:t>
+        <w:t>(invited) R</w:t>
       </w:r>
       <w:r>
         <w:rPr>
           <w:b/>
           <w:bCs w:val="0"/>
         </w:rPr>
+        <w:t>.</w:t>
+      </w:r>
+      <w:r>
+        <w:rPr>
+          <w:b/>
+          <w:bCs w:val="0"/>
+        </w:rPr>
         <w:t xml:space="preserve"> Hirayama</w:t>
       </w:r>
       <w:r>
-        <w:t xml:space="preserve">, ‘To BEM or not to </w:t>
+        <w:t>, G</w:t>
+      </w:r>
+      <w:r>
+        <w:t>.</w:t>
+      </w:r>
+      <w:r>
+        <w:t xml:space="preserve"> Christopoulos, D</w:t>
+      </w:r>
+      <w:r>
+        <w:t>.</w:t>
+      </w:r>
+      <w:r>
+        <w:t xml:space="preserve"> M</w:t>
+      </w:r>
+      <w:r>
+        <w:t>.</w:t>
+      </w:r>
+      <w:r>
+        <w:t xml:space="preserve"> Plasencia</w:t>
+      </w:r>
+      <w:r>
+        <w:t>,</w:t>
+      </w:r>
+      <w:r>
+        <w:t xml:space="preserve"> and S</w:t>
+      </w:r>
+      <w:r>
+        <w:t>.</w:t>
+      </w:r>
+      <w:r>
+        <w:t xml:space="preserve"> Subramanian, ‘Acoustic mid-air displays in the presence of sound-scattering objects’, LDC 2023, Yokohama, Japan (04/2023).</w:t>
+      </w:r>
+    </w:p>
+    <w:p>
+      <w:pPr>
+        <w:pStyle w:val="ListParagraph"/>
+      </w:pPr>
+      <w:r>
+        <w:t>L. Gao, J. Hardwick, D. M. Plasencia, S. Subramanian</w:t>
+      </w:r>
+      <w:r>
+        <w:t>,</w:t>
+      </w:r>
+      <w:r>
+        <w:t xml:space="preserve"> and </w:t>
+      </w:r>
+      <w:r>
+        <w:rPr>
+          <w:b/>
+          <w:bCs w:val="0"/>
+        </w:rPr>
+        <w:t>R. Hirayama</w:t>
+      </w:r>
+      <w:r>
+        <w:t>, ‘</w:t>
+      </w:r>
+      <w:proofErr w:type="spellStart"/>
+      <w:r>
+        <w:t>DataLev</w:t>
+      </w:r>
+      <w:proofErr w:type="spellEnd"/>
+      <w:r>
+        <w:t xml:space="preserve">: Acoustophoretic data </w:t>
+      </w:r>
+      <w:proofErr w:type="spellStart"/>
+      <w:r>
+        <w:t>physicalisation</w:t>
+      </w:r>
+      <w:proofErr w:type="spellEnd"/>
+      <w:r>
+        <w:t>’, UIST 2022 (Demo</w:t>
+      </w:r>
+      <w:r>
+        <w:t>nstration</w:t>
+      </w:r>
+      <w:r>
+        <w:t xml:space="preserve">), Bend, USA (10/2022). </w:t>
+      </w:r>
+    </w:p>
+    <w:p>
+      <w:pPr>
+        <w:pStyle w:val="ListParagraph"/>
+      </w:pPr>
+      <w:r>
+        <w:t xml:space="preserve">S. Bansal, </w:t>
+      </w:r>
+      <w:r>
+        <w:rPr>
+          <w:b/>
+          <w:bCs w:val="0"/>
+        </w:rPr>
+        <w:t>R. Hirayama</w:t>
+      </w:r>
+      <w:r>
+        <w:rPr>
+          <w:b/>
+          <w:bCs w:val="0"/>
+        </w:rPr>
+        <w:t>,</w:t>
+      </w:r>
+      <w:r>
+        <w:t xml:space="preserve"> and S. Subramanian, ‘</w:t>
+      </w:r>
+      <w:proofErr w:type="spellStart"/>
+      <w:r>
+        <w:t>Fluido</w:t>
+      </w:r>
+      <w:proofErr w:type="spellEnd"/>
+      <w:r>
+        <w:t xml:space="preserve">-acoustics: Dynamic multi-slit metamaterial tuned using liquid droplets’, </w:t>
+      </w:r>
+      <w:proofErr w:type="spellStart"/>
+      <w:r>
+        <w:t>Acoustofluidics</w:t>
+      </w:r>
+      <w:proofErr w:type="spellEnd"/>
+      <w:r>
+        <w:t xml:space="preserve"> 2022, Glasgow, Scotland (10/2022).</w:t>
+      </w:r>
+    </w:p>
+    <w:p>
+      <w:pPr>
+        <w:pStyle w:val="ListParagraph"/>
+      </w:pPr>
+      <w:r>
+        <w:rPr>
+          <w:b/>
+        </w:rPr>
+        <w:t>(invited) R. Hirayama</w:t>
+      </w:r>
+      <w:r>
+        <w:t xml:space="preserve">, </w:t>
+      </w:r>
+      <w:r>
+        <w:t>‘Multimodal 3D display using ultrasound’</w:t>
+      </w:r>
+      <w:r>
+        <w:t xml:space="preserve">, </w:t>
+      </w:r>
+      <w:r>
+        <w:t xml:space="preserve">3DSA 2021, Online </w:t>
+      </w:r>
+      <w:r>
+        <w:t>(</w:t>
+      </w:r>
+      <w:r>
+        <w:t>12/</w:t>
+      </w:r>
+      <w:r>
+        <w:t>20</w:t>
+      </w:r>
+      <w:r>
+        <w:t>21</w:t>
+      </w:r>
+      <w:r>
+        <w:t>).</w:t>
+      </w:r>
+    </w:p>
+    <w:p>
+      <w:pPr>
+        <w:pStyle w:val="ListParagraph"/>
+      </w:pPr>
+      <w:r>
+        <w:rPr>
+          <w:b/>
+        </w:rPr>
+        <w:t>(invited) R. Hirayama</w:t>
+      </w:r>
+      <w:r>
+        <w:t xml:space="preserve">, D. M. Plasencia, </w:t>
+      </w:r>
+      <w:r>
+        <w:t>R</w:t>
+      </w:r>
+      <w:r>
+        <w:t xml:space="preserve">. </w:t>
+      </w:r>
+      <w:r>
+        <w:t>Montano</w:t>
+      </w:r>
+      <w:r>
+        <w:t>,</w:t>
+      </w:r>
+      <w:r>
+        <w:t xml:space="preserve"> and S. Subramanian, </w:t>
+      </w:r>
+      <w:r>
+        <w:t xml:space="preserve">‘Paradigm shift from high-speed </w:t>
       </w:r>
       <w:proofErr w:type="gramStart"/>
       <w:r>
-        <w:t>BEM?:</w:t>
+        <w:t>single-point</w:t>
       </w:r>
       <w:proofErr w:type="gramEnd"/>
       <w:r>
-        <w:t xml:space="preserve"> Does Modelling Sound Scattering Improve Ultrasonic Mid-Air Haptics?’, CHI 2025 (Late Breaking Work), Yokohama, Japan (04/2025).</w:t>
-      </w:r>
-    </w:p>
-    <w:p>
-      <w:pPr>
-        <w:pStyle w:val="ListParagraph"/>
-      </w:pPr>
-      <w:r>
-        <w:t>G</w:t>
+        <w:t xml:space="preserve"> to high-speed multipoint algorithms for multimodal acoustic displays’</w:t>
+      </w:r>
+      <w:r>
+        <w:t xml:space="preserve">, </w:t>
+      </w:r>
+      <w:r>
+        <w:t xml:space="preserve">IDW 2021, Online </w:t>
+      </w:r>
+      <w:r>
+        <w:t>(</w:t>
+      </w:r>
+      <w:r>
+        <w:t>12/</w:t>
+      </w:r>
+      <w:r>
+        <w:t>20</w:t>
+      </w:r>
+      <w:r>
+        <w:t>20</w:t>
+      </w:r>
+      <w:r>
+        <w:t>).</w:t>
+      </w:r>
+    </w:p>
+    <w:p>
+      <w:pPr>
+        <w:pStyle w:val="ListParagraph"/>
+      </w:pPr>
+      <w:r>
+        <w:rPr>
+          <w:b/>
+        </w:rPr>
+        <w:t>(invited) R. Hirayama</w:t>
+      </w:r>
+      <w:r>
+        <w:t>, D. M. Plasencia, N. Masuda</w:t>
+      </w:r>
+      <w:r>
+        <w:t>,</w:t>
+      </w:r>
+      <w:r>
+        <w:t xml:space="preserve"> and S. Subramanian, </w:t>
+      </w:r>
+      <w:r>
+        <w:t>‘Multimodal acoustic trapping display’</w:t>
+      </w:r>
+      <w:r>
+        <w:t xml:space="preserve">, </w:t>
+      </w:r>
+      <w:r>
+        <w:t xml:space="preserve">IDW 2020, Online </w:t>
+      </w:r>
+      <w:r>
+        <w:t>(</w:t>
+      </w:r>
+      <w:r>
+        <w:t>12/</w:t>
+      </w:r>
+      <w:r>
+        <w:t>20</w:t>
+      </w:r>
+      <w:r>
+        <w:t>20</w:t>
+      </w:r>
+      <w:r>
+        <w:t>).</w:t>
+      </w:r>
+    </w:p>
+    <w:p>
+      <w:pPr>
+        <w:pStyle w:val="ListParagraph"/>
+      </w:pPr>
+      <w:r>
+        <w:rPr>
+          <w:b/>
+        </w:rPr>
+        <w:t>(invited) R. Hirayama</w:t>
+      </w:r>
+      <w:r>
+        <w:t>, D. M. Plasencia, N. Masuda</w:t>
+      </w:r>
+      <w:r>
+        <w:t>,</w:t>
+      </w:r>
+      <w:r>
+        <w:t xml:space="preserve"> and S. Subramanian, </w:t>
+      </w:r>
+      <w:r>
+        <w:t>‘Acoustic levitation for multimodal volumetric display’</w:t>
+      </w:r>
+      <w:r>
+        <w:t xml:space="preserve">, </w:t>
+      </w:r>
+      <w:r>
+        <w:t xml:space="preserve">SPIE Optics + Photonics 2020 </w:t>
+      </w:r>
+      <w:r>
+        <w:t xml:space="preserve">(Proc. SPIE </w:t>
+      </w:r>
+      <w:r>
+        <w:t>11463)</w:t>
+      </w:r>
+      <w:r>
+        <w:t>, Optical Trapping and Optical Micromanipulation XVII; 114630Q</w:t>
+      </w:r>
+      <w:r>
+        <w:t xml:space="preserve">, </w:t>
+      </w:r>
+      <w:proofErr w:type="gramStart"/>
+      <w:r>
+        <w:t>Online</w:t>
+      </w:r>
+      <w:proofErr w:type="gramEnd"/>
+      <w:r>
+        <w:t xml:space="preserve"> </w:t>
+      </w:r>
+      <w:r>
+        <w:t>(</w:t>
+      </w:r>
+      <w:r>
+        <w:t>08/</w:t>
+      </w:r>
+      <w:r>
+        <w:t>20</w:t>
+      </w:r>
+      <w:r>
+        <w:t>20</w:t>
+      </w:r>
+      <w:r>
+        <w:t>)</w:t>
       </w:r>
       <w:r>
         <w:t>.</w:t>
       </w:r>
-      <w:r>
-        <w:t xml:space="preserve"> Christopoulos, </w:t>
-      </w:r>
-      <w:r>
-        <w:t>L.</w:t>
-      </w:r>
-      <w:r>
-        <w:t xml:space="preserve"> Gao, </w:t>
-      </w:r>
-      <w:r>
-        <w:t>D.</w:t>
-      </w:r>
-      <w:r>
-        <w:t xml:space="preserve"> </w:t>
-      </w:r>
-      <w:r>
-        <w:t>M.</w:t>
-      </w:r>
-      <w:r>
-        <w:t xml:space="preserve"> Plasencia, </w:t>
-      </w:r>
-      <w:r>
-        <w:t>M.</w:t>
-      </w:r>
-      <w:r>
-        <w:t xml:space="preserve"> </w:t>
-      </w:r>
-      <w:proofErr w:type="spellStart"/>
-      <w:r>
-        <w:t>Betcke</w:t>
-      </w:r>
-      <w:proofErr w:type="spellEnd"/>
-      <w:r>
-        <w:t xml:space="preserve">, </w:t>
-      </w:r>
-      <w:r>
-        <w:rPr>
-          <w:b/>
-          <w:bCs w:val="0"/>
-        </w:rPr>
-        <w:t>R.</w:t>
-      </w:r>
-      <w:r>
-        <w:rPr>
-          <w:b/>
-          <w:bCs w:val="0"/>
-        </w:rPr>
-        <w:t xml:space="preserve"> Hirayama</w:t>
-      </w:r>
-      <w:r>
-        <w:t xml:space="preserve">, and </w:t>
-      </w:r>
-      <w:r>
-        <w:t>S.</w:t>
-      </w:r>
-      <w:r>
-        <w:t xml:space="preserve"> Subramanian, ‘Temporal acoustic point holography’, SIGGRAPH 2024 (Conference Papers), Denver, USA (07/2024).</w:t>
-      </w:r>
-    </w:p>
-    <w:p>
-      <w:pPr>
-        <w:pStyle w:val="ListParagraph"/>
-      </w:pPr>
-      <w:r>
-        <w:t>L.</w:t>
-      </w:r>
-      <w:r>
-        <w:t xml:space="preserve"> Gao, </w:t>
-      </w:r>
-      <w:r>
-        <w:t>G.</w:t>
-      </w:r>
-      <w:r>
-        <w:t xml:space="preserve"> Christopoulos, </w:t>
-      </w:r>
-      <w:r>
-        <w:t>P.</w:t>
-      </w:r>
-      <w:r>
-        <w:t xml:space="preserve"> Mittal, </w:t>
-      </w:r>
-      <w:r>
-        <w:t>R.</w:t>
-      </w:r>
-      <w:r>
-        <w:t xml:space="preserve"> Hirayama, and </w:t>
-      </w:r>
-      <w:r>
-        <w:t>S.</w:t>
-      </w:r>
-      <w:r>
-        <w:t xml:space="preserve"> Subramanian, ‘</w:t>
-      </w:r>
-      <w:proofErr w:type="spellStart"/>
-      <w:r>
-        <w:t>StableLev</w:t>
-      </w:r>
-      <w:proofErr w:type="spellEnd"/>
-      <w:r>
-        <w:t>: Data-driven stability enhancement for multi-particle acoustic levitation’, CHI 2024 (Paper), Hawaii, USA (05/2024).</w:t>
-      </w:r>
-    </w:p>
-    <w:p>
-      <w:pPr>
-        <w:pStyle w:val="ListParagraph"/>
-      </w:pPr>
-      <w:r>
-        <w:t>L. Gao, P. Irani, S. Subramanian, G Prabhakar, D. M. Plasencia</w:t>
+    </w:p>
+    <w:p>
+      <w:pPr>
+        <w:pStyle w:val="ListParagraph"/>
+      </w:pPr>
+      <w:r>
+        <w:t xml:space="preserve">D. M. Plasencia, </w:t>
+      </w:r>
+      <w:r>
+        <w:rPr>
+          <w:b/>
+        </w:rPr>
+        <w:t>R. Hirayama</w:t>
+      </w:r>
+      <w:r>
+        <w:t>, R. Montano</w:t>
       </w:r>
       <w:r>
         <w:t>,</w:t>
       </w:r>
       <w:r>
-        <w:t xml:space="preserve"> and</w:t>
-      </w:r>
-      <w:r>
-        <w:rPr>
-          <w:b/>
-        </w:rPr>
-        <w:t xml:space="preserve"> R</w:t>
-      </w:r>
-      <w:r>
-        <w:rPr>
-          <w:b/>
-        </w:rPr>
-        <w:t>.</w:t>
-      </w:r>
-      <w:r>
-        <w:rPr>
-          <w:b/>
-        </w:rPr>
-        <w:t xml:space="preserve"> Hirayama</w:t>
-      </w:r>
-      <w:r>
-        <w:t>, ‘</w:t>
-      </w:r>
-      <w:proofErr w:type="spellStart"/>
-      <w:r>
-        <w:t>DataLev</w:t>
-      </w:r>
-      <w:proofErr w:type="spellEnd"/>
-      <w:r>
-        <w:t xml:space="preserve">: Mid-air data </w:t>
-      </w:r>
-      <w:proofErr w:type="spellStart"/>
-      <w:r>
-        <w:t>physicalisation</w:t>
-      </w:r>
-      <w:proofErr w:type="spellEnd"/>
-      <w:r>
-        <w:t xml:space="preserve"> using acoustic levitation</w:t>
-      </w:r>
-      <w:r>
-        <w:t>’, CHI 2023, Hamburg, Germany (04/2023).</w:t>
-      </w:r>
-    </w:p>
-    <w:p>
-      <w:pPr>
-        <w:pStyle w:val="ListParagraph"/>
-      </w:pPr>
-      <w:r>
-        <w:rPr>
-          <w:b/>
-          <w:bCs w:val="0"/>
-        </w:rPr>
-        <w:t>(invited) R</w:t>
-      </w:r>
-      <w:r>
-        <w:rPr>
-          <w:b/>
-          <w:bCs w:val="0"/>
-        </w:rPr>
-        <w:t>.</w:t>
-      </w:r>
-      <w:r>
-        <w:rPr>
-          <w:b/>
-          <w:bCs w:val="0"/>
-        </w:rPr>
-        <w:t xml:space="preserve"> Hirayama</w:t>
-      </w:r>
-      <w:r>
-        <w:t>, G</w:t>
-      </w:r>
-      <w:r>
-        <w:t>.</w:t>
-      </w:r>
-      <w:r>
-        <w:t xml:space="preserve"> Christopoulos, D</w:t>
-      </w:r>
-      <w:r>
-        <w:t>.</w:t>
-      </w:r>
-      <w:r>
-        <w:t xml:space="preserve"> M</w:t>
-      </w:r>
-      <w:r>
-        <w:t>.</w:t>
-      </w:r>
-      <w:r>
-        <w:t xml:space="preserve"> Plasencia</w:t>
+        <w:t xml:space="preserve"> and S. Subramanian, ‘GS-PAT: High-speed multi-point sound-fields for phased arrays of transducers’, SIGGRAPH 2020 Technical Papers, </w:t>
+      </w:r>
+      <w:proofErr w:type="gramStart"/>
+      <w:r>
+        <w:t>Online</w:t>
+      </w:r>
+      <w:proofErr w:type="gramEnd"/>
+      <w:r>
+        <w:t xml:space="preserve"> (08/2020).</w:t>
+      </w:r>
+    </w:p>
+    <w:p>
+      <w:pPr>
+        <w:pStyle w:val="ListParagraph"/>
+      </w:pPr>
+      <w:r>
+        <w:t xml:space="preserve">D. Matsumoto, </w:t>
+      </w:r>
+      <w:r>
+        <w:rPr>
+          <w:b/>
+        </w:rPr>
+        <w:t>R. Hirayama</w:t>
+      </w:r>
+      <w:r>
+        <w:t xml:space="preserve">, N. </w:t>
+      </w:r>
+      <w:proofErr w:type="spellStart"/>
+      <w:r>
+        <w:t>Hoshikawa</w:t>
+      </w:r>
+      <w:proofErr w:type="spellEnd"/>
+      <w:r>
+        <w:t xml:space="preserve">, H. Nakayama, T. </w:t>
+      </w:r>
+      <w:proofErr w:type="spellStart"/>
+      <w:r>
+        <w:t>Shimobaba</w:t>
+      </w:r>
+      <w:proofErr w:type="spellEnd"/>
+      <w:r>
+        <w:t>, T. Ito</w:t>
       </w:r>
       <w:r>
         <w:t>,</w:t>
       </w:r>
       <w:r>
-        <w:t xml:space="preserve"> and S</w:t>
-      </w:r>
-      <w:r>
-        <w:t>.</w:t>
-      </w:r>
-      <w:r>
-        <w:t xml:space="preserve"> Subramanian, ‘Acoustic mid-air displays in the presence of sound-scattering objects’, LDC 2023, Yokohama, Japan (04/2023).</w:t>
-      </w:r>
-    </w:p>
-    <w:p>
-      <w:pPr>
-        <w:pStyle w:val="ListParagraph"/>
-      </w:pPr>
-      <w:r>
-        <w:t>L. Gao, J. Hardwick, D. M. Plasencia, S. Subramanian</w:t>
+        <w:t xml:space="preserve"> and A. Shiraki, ‘GPU acceleration of algorithm to design directional volumetric display for real-time’, IDW 2019 / 3DSA 2019, Sapporo, Japan (11/2019).</w:t>
+      </w:r>
+    </w:p>
+    <w:p>
+      <w:pPr>
+        <w:pStyle w:val="ListParagraph"/>
+      </w:pPr>
+      <w:r>
+        <w:t xml:space="preserve">T. Murase, </w:t>
+      </w:r>
+      <w:r>
+        <w:rPr>
+          <w:b/>
+        </w:rPr>
+        <w:t>R. Hirayama</w:t>
+      </w:r>
+      <w:r>
+        <w:t xml:space="preserve">, N. </w:t>
+      </w:r>
+      <w:proofErr w:type="spellStart"/>
+      <w:r>
+        <w:t>Hoshikawa</w:t>
+      </w:r>
+      <w:proofErr w:type="spellEnd"/>
+      <w:r>
+        <w:t xml:space="preserve">, H. Nakayama, T. </w:t>
+      </w:r>
+      <w:proofErr w:type="spellStart"/>
+      <w:r>
+        <w:t>Shimobaba</w:t>
+      </w:r>
+      <w:proofErr w:type="spellEnd"/>
+      <w:r>
+        <w:t>, T. Ito</w:t>
       </w:r>
       <w:r>
         <w:t>,</w:t>
       </w:r>
       <w:r>
-        <w:t xml:space="preserve"> and </w:t>
-      </w:r>
-      <w:r>
-        <w:rPr>
-          <w:b/>
-          <w:bCs w:val="0"/>
+        <w:t xml:space="preserve"> and A. Shiraki, ‘Development of volumetric display capable of transmitting information in different languages using language identification’, IDW 2019 / 3DSA 2019, Sapporo, Japan (11/2019).</w:t>
+      </w:r>
+    </w:p>
+    <w:p>
+      <w:pPr>
+        <w:pStyle w:val="ListParagraph"/>
+      </w:pPr>
+      <w:r>
+        <w:t xml:space="preserve">M. Baba, </w:t>
+      </w:r>
+      <w:r>
+        <w:rPr>
+          <w:b/>
         </w:rPr>
         <w:t>R. Hirayama</w:t>
       </w:r>
       <w:r>
-        <w:t>, ‘</w:t>
-      </w:r>
-      <w:proofErr w:type="spellStart"/>
-      <w:r>
-        <w:t>DataLev</w:t>
-      </w:r>
-      <w:proofErr w:type="spellEnd"/>
-      <w:r>
-        <w:t xml:space="preserve">: Acoustophoretic data </w:t>
-      </w:r>
-      <w:proofErr w:type="spellStart"/>
-      <w:r>
-        <w:t>physicalisation</w:t>
-      </w:r>
-      <w:proofErr w:type="spellEnd"/>
-      <w:r>
-        <w:t>’, UIST 2022 (Demo</w:t>
-      </w:r>
-      <w:r>
-        <w:t>nstration</w:t>
-      </w:r>
-      <w:r>
-        <w:t xml:space="preserve">), Bend, USA (10/2022). </w:t>
-      </w:r>
-    </w:p>
-    <w:p>
-      <w:pPr>
-        <w:pStyle w:val="ListParagraph"/>
-      </w:pPr>
-      <w:r>
-        <w:t xml:space="preserve">S. Bansal, </w:t>
-      </w:r>
-      <w:r>
-        <w:rPr>
-          <w:b/>
-          <w:bCs w:val="0"/>
+        <w:t xml:space="preserve">, N. </w:t>
+      </w:r>
+      <w:proofErr w:type="spellStart"/>
+      <w:r>
+        <w:t>Hoshikawa</w:t>
+      </w:r>
+      <w:proofErr w:type="spellEnd"/>
+      <w:r>
+        <w:t xml:space="preserve">, H. Nakayama, T. </w:t>
+      </w:r>
+      <w:proofErr w:type="spellStart"/>
+      <w:r>
+        <w:t>Shimobaba</w:t>
+      </w:r>
+      <w:proofErr w:type="spellEnd"/>
+      <w:r>
+        <w:t>, T. Ito</w:t>
+      </w:r>
+      <w:r>
+        <w:t>,</w:t>
+      </w:r>
+      <w:r>
+        <w:t xml:space="preserve"> and A. Shiraki, ‘Implemented of images and sounds person tracking system using directional volumetric display’, IDW 2019 / 3DSA 2019, Sapporo, Japan (11/2019).</w:t>
+      </w:r>
+    </w:p>
+    <w:p>
+      <w:pPr>
+        <w:pStyle w:val="ListParagraph"/>
+      </w:pPr>
+      <w:r>
+        <w:t xml:space="preserve">D. Matsumoto, T. Murase, </w:t>
+      </w:r>
+      <w:r>
+        <w:rPr>
+          <w:b/>
         </w:rPr>
         <w:t>R. Hirayama</w:t>
       </w:r>
       <w:r>
-        <w:rPr>
-          <w:b/>
-          <w:bCs w:val="0"/>
-        </w:rPr>
+        <w:t xml:space="preserve">, H. Nakayama, T. </w:t>
+      </w:r>
+      <w:proofErr w:type="spellStart"/>
+      <w:r>
+        <w:t>Shimobaba</w:t>
+      </w:r>
+      <w:proofErr w:type="spellEnd"/>
+      <w:r>
+        <w:t xml:space="preserve"> T. Ito, and A. Shiraki, ‘Subjective image quality evaluation to compare algorithms for designing a directional volumetric display’, IDW 2018, Nagoya, Japan (12/2018).</w:t>
+      </w:r>
+    </w:p>
+    <w:p>
+      <w:pPr>
+        <w:pStyle w:val="ListParagraph"/>
+      </w:pPr>
+      <w:r>
+        <w:t xml:space="preserve">T. Murase, D. Matsumoto, </w:t>
+      </w:r>
+      <w:r>
+        <w:rPr>
+          <w:b/>
+        </w:rPr>
+        <w:t>R. Hirayama</w:t>
+      </w:r>
+      <w:r>
+        <w:t xml:space="preserve">, H. Nakayama, T. </w:t>
+      </w:r>
+      <w:proofErr w:type="spellStart"/>
+      <w:r>
+        <w:t>Shimobaba</w:t>
+      </w:r>
+      <w:proofErr w:type="spellEnd"/>
+      <w:r>
+        <w:t>, T. Ito</w:t>
+      </w:r>
+      <w:r>
         <w:t>,</w:t>
       </w:r>
       <w:r>
-        <w:t xml:space="preserve"> and S. Subramanian, ‘</w:t>
-      </w:r>
-      <w:proofErr w:type="spellStart"/>
-      <w:r>
-        <w:t>Fluido</w:t>
-      </w:r>
-      <w:proofErr w:type="spellEnd"/>
-      <w:r>
-        <w:t xml:space="preserve">-acoustics: Dynamic multi-slit metamaterial tuned using liquid droplets’, </w:t>
-      </w:r>
-      <w:proofErr w:type="spellStart"/>
-      <w:r>
-        <w:t>Acoustofluidics</w:t>
-      </w:r>
-      <w:proofErr w:type="spellEnd"/>
-      <w:r>
-        <w:t xml:space="preserve"> 2022, Glasgow, Scotland (10/2022).</w:t>
-      </w:r>
-    </w:p>
-    <w:p>
-      <w:pPr>
-        <w:pStyle w:val="ListParagraph"/>
-      </w:pPr>
-      <w:r>
-        <w:rPr>
-          <w:b/>
-        </w:rPr>
-        <w:t>(invited) R. Hirayama</w:t>
-      </w:r>
-      <w:r>
-        <w:t xml:space="preserve">, </w:t>
-      </w:r>
-      <w:r>
-        <w:t>‘Multimodal 3D display using ultrasound’</w:t>
-      </w:r>
-      <w:r>
-        <w:t xml:space="preserve">, </w:t>
-      </w:r>
-      <w:r>
-        <w:t xml:space="preserve">3DSA 2021, Online </w:t>
-      </w:r>
-      <w:r>
-        <w:t>(</w:t>
-      </w:r>
-      <w:r>
-        <w:t>12/</w:t>
-      </w:r>
-      <w:r>
-        <w:t>20</w:t>
-      </w:r>
-      <w:r>
-        <w:t>21</w:t>
-      </w:r>
-      <w:r>
-        <w:t>).</w:t>
-      </w:r>
-    </w:p>
-    <w:p>
-      <w:pPr>
-        <w:pStyle w:val="ListParagraph"/>
-      </w:pPr>
-      <w:r>
-        <w:rPr>
-          <w:b/>
-        </w:rPr>
-        <w:t>(invited) R. Hirayama</w:t>
-      </w:r>
-      <w:r>
-        <w:t xml:space="preserve">, D. M. Plasencia, </w:t>
-      </w:r>
-      <w:r>
-        <w:t>R</w:t>
-      </w:r>
-      <w:r>
-        <w:t xml:space="preserve">. </w:t>
-      </w:r>
-      <w:r>
-        <w:t>Montano</w:t>
-      </w:r>
+        <w:t xml:space="preserve"> and A. Shiraki, ‘Image quality improvement for 3D structure exhibiting multiple 2D patterns using convolutional neural networks’, IDW 2018, Nagoya, Japan (12/2018). </w:t>
+      </w:r>
+    </w:p>
+    <w:p>
+      <w:pPr>
+        <w:pStyle w:val="ListParagraph"/>
+      </w:pPr>
+      <w:r>
+        <w:lastRenderedPageBreak/>
+        <w:t xml:space="preserve">D. Matsumoto, A. Shiraki, </w:t>
+      </w:r>
+      <w:r>
+        <w:rPr>
+          <w:b/>
+        </w:rPr>
+        <w:t>R. Hirayama</w:t>
+      </w:r>
+      <w:r>
+        <w:t xml:space="preserve">, H. Nakayama, T. </w:t>
+      </w:r>
+      <w:proofErr w:type="spellStart"/>
+      <w:r>
+        <w:t>Kakue</w:t>
+      </w:r>
+      <w:proofErr w:type="spellEnd"/>
+      <w:r>
+        <w:t xml:space="preserve">, T. </w:t>
+      </w:r>
+      <w:proofErr w:type="spellStart"/>
+      <w:r>
+        <w:t>Shimobaba</w:t>
+      </w:r>
+      <w:proofErr w:type="spellEnd"/>
       <w:r>
         <w:t>,</w:t>
       </w:r>
       <w:r>
-        <w:t xml:space="preserve"> and S. Subramanian, </w:t>
-      </w:r>
-      <w:r>
-        <w:t xml:space="preserve">‘Paradigm shift from high-speed </w:t>
-      </w:r>
-      <w:proofErr w:type="gramStart"/>
-      <w:r>
-        <w:t>single-point</w:t>
-      </w:r>
-      <w:proofErr w:type="gramEnd"/>
-      <w:r>
-        <w:t xml:space="preserve"> to high-speed multipoint algorithms for multimodal acoustic displays’</w:t>
-      </w:r>
-      <w:r>
-        <w:t xml:space="preserve">, </w:t>
-      </w:r>
-      <w:r>
-        <w:t xml:space="preserve">IDW 2021, Online </w:t>
-      </w:r>
-      <w:r>
-        <w:t>(</w:t>
-      </w:r>
-      <w:r>
-        <w:t>12/</w:t>
-      </w:r>
-      <w:r>
-        <w:t>20</w:t>
-      </w:r>
-      <w:r>
-        <w:t>20</w:t>
-      </w:r>
-      <w:r>
-        <w:t>).</w:t>
-      </w:r>
-    </w:p>
-    <w:p>
-      <w:pPr>
-        <w:pStyle w:val="ListParagraph"/>
-      </w:pPr>
-      <w:r>
-        <w:rPr>
-          <w:b/>
-        </w:rPr>
-        <w:t>(invited) R. Hirayama</w:t>
-      </w:r>
-      <w:r>
-        <w:t>, D. M. Plasencia, N. Masuda</w:t>
-      </w:r>
+        <w:t xml:space="preserve"> and T. Ito, ‘Improvement of the algorithm for designing a 3D object exhibiting multiple 2D images’, 3DSA 2018, Taipei, Taiwan (08/2018).</w:t>
+      </w:r>
+    </w:p>
+    <w:p>
+      <w:pPr>
+        <w:pStyle w:val="ListParagraph"/>
+      </w:pPr>
+      <w:r>
+        <w:t xml:space="preserve">M. Ikeda, A. Shiraki, </w:t>
+      </w:r>
+      <w:r>
+        <w:rPr>
+          <w:b/>
+        </w:rPr>
+        <w:t>R. Hirayama</w:t>
+      </w:r>
+      <w:r>
+        <w:t xml:space="preserve">, T. </w:t>
+      </w:r>
+      <w:proofErr w:type="spellStart"/>
+      <w:r>
+        <w:t>Kakue</w:t>
+      </w:r>
+      <w:proofErr w:type="spellEnd"/>
+      <w:r>
+        <w:t xml:space="preserve">, T. </w:t>
+      </w:r>
+      <w:proofErr w:type="spellStart"/>
+      <w:r>
+        <w:t>Shimobaba</w:t>
+      </w:r>
+      <w:proofErr w:type="spellEnd"/>
       <w:r>
         <w:t>,</w:t>
       </w:r>
       <w:r>
-        <w:t xml:space="preserve"> and S. Subramanian, </w:t>
-      </w:r>
-      <w:r>
-        <w:t>‘Multimodal acoustic trapping display’</w:t>
-      </w:r>
-      <w:r>
-        <w:t xml:space="preserve">, </w:t>
-      </w:r>
-      <w:r>
-        <w:t xml:space="preserve">IDW 2020, Online </w:t>
-      </w:r>
-      <w:r>
-        <w:t>(</w:t>
-      </w:r>
-      <w:r>
-        <w:t>12/</w:t>
-      </w:r>
-      <w:r>
-        <w:t>20</w:t>
-      </w:r>
-      <w:r>
-        <w:t>20</w:t>
-      </w:r>
-      <w:r>
-        <w:t>).</w:t>
-      </w:r>
-    </w:p>
-    <w:p>
-      <w:pPr>
-        <w:pStyle w:val="ListParagraph"/>
-      </w:pPr>
-      <w:r>
-        <w:rPr>
-          <w:b/>
-        </w:rPr>
-        <w:t>(invited) R. Hirayama</w:t>
-      </w:r>
-      <w:r>
-        <w:t>, D. M. Plasencia, N. Masuda</w:t>
-      </w:r>
+        <w:t xml:space="preserve"> and T. Ito, ‘Simulation of the projection mapping to a directional volumetric display’, IDW 2017, Sendai, Japan (12/2017).</w:t>
+      </w:r>
+    </w:p>
+    <w:p>
+      <w:pPr>
+        <w:pStyle w:val="ListParagraph"/>
+      </w:pPr>
+      <w:r>
+        <w:rPr>
+          <w:b/>
+        </w:rPr>
+        <w:t>R. Hirayama</w:t>
+      </w:r>
+      <w:r>
+        <w:t xml:space="preserve">, H. Nakayama, A. Shiraki, T. </w:t>
+      </w:r>
+      <w:proofErr w:type="spellStart"/>
+      <w:r>
+        <w:t>Kakue</w:t>
+      </w:r>
+      <w:proofErr w:type="spellEnd"/>
+      <w:r>
+        <w:t xml:space="preserve">, T. </w:t>
+      </w:r>
+      <w:proofErr w:type="spellStart"/>
+      <w:r>
+        <w:t>Shimobaba</w:t>
+      </w:r>
+      <w:proofErr w:type="spellEnd"/>
       <w:r>
         <w:t>,</w:t>
       </w:r>
       <w:r>
-        <w:t xml:space="preserve"> and S. Subramanian, </w:t>
-      </w:r>
-      <w:r>
-        <w:t>‘Acoustic levitation for multimodal volumetric display’</w:t>
-      </w:r>
-      <w:r>
-        <w:t xml:space="preserve">, </w:t>
-      </w:r>
-      <w:r>
-        <w:t xml:space="preserve">SPIE Optics + Photonics 2020 </w:t>
-      </w:r>
-      <w:r>
-        <w:t xml:space="preserve">(Proc. SPIE </w:t>
-      </w:r>
-      <w:r>
-        <w:t>11463)</w:t>
-      </w:r>
-      <w:r>
-        <w:t>, Optical Trapping and Optical Micromanipulation XVII; 114630Q</w:t>
-      </w:r>
-      <w:r>
-        <w:t xml:space="preserve">, </w:t>
-      </w:r>
-      <w:proofErr w:type="gramStart"/>
-      <w:r>
-        <w:t>Online</w:t>
-      </w:r>
-      <w:proofErr w:type="gramEnd"/>
-      <w:r>
-        <w:t xml:space="preserve"> </w:t>
-      </w:r>
-      <w:r>
-        <w:t>(</w:t>
-      </w:r>
-      <w:r>
-        <w:t>08/</w:t>
-      </w:r>
-      <w:r>
-        <w:t>20</w:t>
-      </w:r>
-      <w:r>
-        <w:t>20</w:t>
-      </w:r>
-      <w:r>
-        <w:t>)</w:t>
-      </w:r>
-      <w:r>
-        <w:t>.</w:t>
-      </w:r>
-    </w:p>
-    <w:p>
-      <w:pPr>
-        <w:pStyle w:val="ListParagraph"/>
-      </w:pPr>
-      <w:r>
-        <w:t xml:space="preserve">D. M. Plasencia, </w:t>
-      </w:r>
+        <w:t xml:space="preserve"> and T. Ito, ‘Controllable </w:t>
+      </w:r>
+      <w:proofErr w:type="spellStart"/>
+      <w:r>
+        <w:t>color</w:t>
+      </w:r>
+      <w:proofErr w:type="spellEnd"/>
+      <w:r>
+        <w:t xml:space="preserve"> particles in a 3D crystal projecting multiple dynamic full-</w:t>
+      </w:r>
+      <w:proofErr w:type="spellStart"/>
+      <w:r>
+        <w:t>color</w:t>
+      </w:r>
+      <w:proofErr w:type="spellEnd"/>
+      <w:r>
+        <w:t xml:space="preserve"> images’, ACM SIGGRAPH 2017 Posters, 73, Los Angeles, USA (07/2017).</w:t>
+      </w:r>
+    </w:p>
+    <w:p>
+      <w:pPr>
+        <w:pStyle w:val="ListParagraph"/>
+      </w:pPr>
       <w:r>
         <w:rPr>
           <w:b/>
@@ -4245,299 +4657,26 @@
         <w:t>R. Hirayama</w:t>
       </w:r>
       <w:r>
-        <w:t>, R. Montano</w:t>
-      </w:r>
+        <w:t xml:space="preserve">, T. Suzuki, T. </w:t>
+      </w:r>
+      <w:proofErr w:type="spellStart"/>
+      <w:r>
+        <w:t>Shimobaba</w:t>
+      </w:r>
+      <w:proofErr w:type="spellEnd"/>
+      <w:r>
+        <w:t xml:space="preserve">, A. Shiraki, M. Naruse, H. Nakayama, T. </w:t>
+      </w:r>
+      <w:proofErr w:type="spellStart"/>
+      <w:r>
+        <w:t>Kakue</w:t>
+      </w:r>
+      <w:proofErr w:type="spellEnd"/>
       <w:r>
         <w:t>,</w:t>
       </w:r>
       <w:r>
-        <w:t xml:space="preserve"> and S. Subramanian, ‘GS-PAT: High-speed multi-point sound-fields for phased arrays of transducers’, SIGGRAPH 2020 Technical Papers, </w:t>
-      </w:r>
-      <w:proofErr w:type="gramStart"/>
-      <w:r>
-        <w:t>Online</w:t>
-      </w:r>
-      <w:proofErr w:type="gramEnd"/>
-      <w:r>
-        <w:t xml:space="preserve"> (08/2020).</w:t>
-      </w:r>
-    </w:p>
-    <w:p>
-      <w:pPr>
-        <w:pStyle w:val="ListParagraph"/>
-      </w:pPr>
-      <w:r>
-        <w:t xml:space="preserve">D. Matsumoto, </w:t>
-      </w:r>
-      <w:r>
-        <w:rPr>
-          <w:b/>
-        </w:rPr>
-        <w:t>R. Hirayama</w:t>
-      </w:r>
-      <w:r>
-        <w:t xml:space="preserve">, N. </w:t>
-      </w:r>
-      <w:proofErr w:type="spellStart"/>
-      <w:r>
-        <w:t>Hoshikawa</w:t>
-      </w:r>
-      <w:proofErr w:type="spellEnd"/>
-      <w:r>
-        <w:t xml:space="preserve">, H. Nakayama, T. </w:t>
-      </w:r>
-      <w:proofErr w:type="spellStart"/>
-      <w:r>
-        <w:t>Shimobaba</w:t>
-      </w:r>
-      <w:proofErr w:type="spellEnd"/>
-      <w:r>
-        <w:t>, T. Ito</w:t>
-      </w:r>
-      <w:r>
-        <w:t>,</w:t>
-      </w:r>
-      <w:r>
-        <w:t xml:space="preserve"> and A. Shiraki, ‘GPU acceleration of algorithm to design directional volumetric display for real-time’, IDW 2019 / 3DSA 2019, Sapporo, Japan (11/2019).</w:t>
-      </w:r>
-    </w:p>
-    <w:p>
-      <w:pPr>
-        <w:pStyle w:val="ListParagraph"/>
-      </w:pPr>
-      <w:r>
-        <w:t xml:space="preserve">T. Murase, </w:t>
-      </w:r>
-      <w:r>
-        <w:rPr>
-          <w:b/>
-        </w:rPr>
-        <w:t>R. Hirayama</w:t>
-      </w:r>
-      <w:r>
-        <w:t xml:space="preserve">, N. </w:t>
-      </w:r>
-      <w:proofErr w:type="spellStart"/>
-      <w:r>
-        <w:t>Hoshikawa</w:t>
-      </w:r>
-      <w:proofErr w:type="spellEnd"/>
-      <w:r>
-        <w:t xml:space="preserve">, H. Nakayama, T. </w:t>
-      </w:r>
-      <w:proofErr w:type="spellStart"/>
-      <w:r>
-        <w:t>Shimobaba</w:t>
-      </w:r>
-      <w:proofErr w:type="spellEnd"/>
-      <w:r>
-        <w:t>, T. Ito</w:t>
-      </w:r>
-      <w:r>
-        <w:t>,</w:t>
-      </w:r>
-      <w:r>
-        <w:t xml:space="preserve"> and A. Shiraki, ‘Development of volumetric display capable of transmitting information in different languages using language identification’, IDW 2019 / 3DSA 2019, Sapporo, Japan (11/2019).</w:t>
-      </w:r>
-    </w:p>
-    <w:p>
-      <w:pPr>
-        <w:pStyle w:val="ListParagraph"/>
-      </w:pPr>
-      <w:r>
-        <w:t xml:space="preserve">M. Baba, </w:t>
-      </w:r>
-      <w:r>
-        <w:rPr>
-          <w:b/>
-        </w:rPr>
-        <w:t>R. Hirayama</w:t>
-      </w:r>
-      <w:r>
-        <w:t xml:space="preserve">, N. </w:t>
-      </w:r>
-      <w:proofErr w:type="spellStart"/>
-      <w:r>
-        <w:t>Hoshikawa</w:t>
-      </w:r>
-      <w:proofErr w:type="spellEnd"/>
-      <w:r>
-        <w:t xml:space="preserve">, H. Nakayama, T. </w:t>
-      </w:r>
-      <w:proofErr w:type="spellStart"/>
-      <w:r>
-        <w:t>Shimobaba</w:t>
-      </w:r>
-      <w:proofErr w:type="spellEnd"/>
-      <w:r>
-        <w:t>, T. Ito</w:t>
-      </w:r>
-      <w:r>
-        <w:t>,</w:t>
-      </w:r>
-      <w:r>
-        <w:t xml:space="preserve"> and A. Shiraki, ‘Implemented of images and sounds person tracking system using directional volumetric display’, IDW 2019 / 3DSA 2019, Sapporo, Japan (11/2019).</w:t>
-      </w:r>
-    </w:p>
-    <w:p>
-      <w:pPr>
-        <w:pStyle w:val="ListParagraph"/>
-      </w:pPr>
-      <w:r>
-        <w:t xml:space="preserve">D. Matsumoto, T. Murase, </w:t>
-      </w:r>
-      <w:r>
-        <w:rPr>
-          <w:b/>
-        </w:rPr>
-        <w:t>R. Hirayama</w:t>
-      </w:r>
-      <w:r>
-        <w:t xml:space="preserve">, H. Nakayama, T. </w:t>
-      </w:r>
-      <w:proofErr w:type="spellStart"/>
-      <w:r>
-        <w:t>Shimobaba</w:t>
-      </w:r>
-      <w:proofErr w:type="spellEnd"/>
-      <w:r>
-        <w:t xml:space="preserve"> T. Ito, and A. Shiraki, ‘Subjective image quality evaluation to compare algorithms for designing a directional volumetric display’, IDW 2018, Nagoya, Japan (12/2018).</w:t>
-      </w:r>
-    </w:p>
-    <w:p>
-      <w:pPr>
-        <w:pStyle w:val="ListParagraph"/>
-      </w:pPr>
-      <w:r>
-        <w:t xml:space="preserve">T. Murase, D. Matsumoto, </w:t>
-      </w:r>
-      <w:r>
-        <w:rPr>
-          <w:b/>
-        </w:rPr>
-        <w:t>R. Hirayama</w:t>
-      </w:r>
-      <w:r>
-        <w:t xml:space="preserve">, H. Nakayama, T. </w:t>
-      </w:r>
-      <w:proofErr w:type="spellStart"/>
-      <w:r>
-        <w:t>Shimobaba</w:t>
-      </w:r>
-      <w:proofErr w:type="spellEnd"/>
-      <w:r>
-        <w:t>, T. Ito</w:t>
-      </w:r>
-      <w:r>
-        <w:t>,</w:t>
-      </w:r>
-      <w:r>
-        <w:t xml:space="preserve"> and A. Shiraki, ‘Image quality improvement for 3D structure exhibiting multiple 2D patterns using convolutional neural networks’, IDW 2018, Nagoya, Japan (12/2018). </w:t>
-      </w:r>
-    </w:p>
-    <w:p>
-      <w:pPr>
-        <w:pStyle w:val="ListParagraph"/>
-      </w:pPr>
-      <w:r>
-        <w:t xml:space="preserve">D. Matsumoto, A. Shiraki, </w:t>
-      </w:r>
-      <w:r>
-        <w:rPr>
-          <w:b/>
-        </w:rPr>
-        <w:t>R. Hirayama</w:t>
-      </w:r>
-      <w:r>
-        <w:t xml:space="preserve">, H. Nakayama, T. </w:t>
-      </w:r>
-      <w:proofErr w:type="spellStart"/>
-      <w:r>
-        <w:t>Kakue</w:t>
-      </w:r>
-      <w:proofErr w:type="spellEnd"/>
-      <w:r>
-        <w:t xml:space="preserve">, T. </w:t>
-      </w:r>
-      <w:proofErr w:type="spellStart"/>
-      <w:r>
-        <w:t>Shimobaba</w:t>
-      </w:r>
-      <w:proofErr w:type="spellEnd"/>
-      <w:r>
-        <w:t>,</w:t>
-      </w:r>
-      <w:r>
-        <w:t xml:space="preserve"> and T. Ito, ‘Improvement of the algorithm for designing a 3D object exhibiting multiple 2D images’, 3DSA 2018, Taipei, Taiwan (08/2018).</w:t>
-      </w:r>
-    </w:p>
-    <w:p>
-      <w:pPr>
-        <w:pStyle w:val="ListParagraph"/>
-      </w:pPr>
-      <w:r>
-        <w:t xml:space="preserve">M. Ikeda, A. Shiraki, </w:t>
-      </w:r>
-      <w:r>
-        <w:rPr>
-          <w:b/>
-        </w:rPr>
-        <w:t>R. Hirayama</w:t>
-      </w:r>
-      <w:r>
-        <w:t xml:space="preserve">, T. </w:t>
-      </w:r>
-      <w:proofErr w:type="spellStart"/>
-      <w:r>
-        <w:t>Kakue</w:t>
-      </w:r>
-      <w:proofErr w:type="spellEnd"/>
-      <w:r>
-        <w:t xml:space="preserve">, T. </w:t>
-      </w:r>
-      <w:proofErr w:type="spellStart"/>
-      <w:r>
-        <w:t>Shimobaba</w:t>
-      </w:r>
-      <w:proofErr w:type="spellEnd"/>
-      <w:r>
-        <w:t>,</w:t>
-      </w:r>
-      <w:r>
-        <w:t xml:space="preserve"> and T. Ito, ‘Simulation of the projection mapping to a directional volumetric display’, IDW 2017, Sendai, Japan (12/2017).</w:t>
-      </w:r>
-    </w:p>
-    <w:p>
-      <w:pPr>
-        <w:pStyle w:val="ListParagraph"/>
-      </w:pPr>
-      <w:r>
-        <w:rPr>
-          <w:b/>
-        </w:rPr>
-        <w:t>R. Hirayama</w:t>
-      </w:r>
-      <w:r>
-        <w:t xml:space="preserve">, H. Nakayama, A. Shiraki, T. </w:t>
-      </w:r>
-      <w:proofErr w:type="spellStart"/>
-      <w:r>
-        <w:t>Kakue</w:t>
-      </w:r>
-      <w:proofErr w:type="spellEnd"/>
-      <w:r>
-        <w:t xml:space="preserve">, T. </w:t>
-      </w:r>
-      <w:proofErr w:type="spellStart"/>
-      <w:r>
-        <w:t>Shimobaba</w:t>
-      </w:r>
-      <w:proofErr w:type="spellEnd"/>
-      <w:r>
-        <w:t>,</w:t>
-      </w:r>
-      <w:r>
-        <w:t xml:space="preserve"> and T. Ito, ‘Controllable </w:t>
+        <w:t xml:space="preserve"> and T. Ito, ‘Inkjet-printed 3D structure projecting multiple full-</w:t>
       </w:r>
       <w:proofErr w:type="spellStart"/>
       <w:r>
@@ -4545,55 +4684,6 @@
       </w:r>
       <w:proofErr w:type="spellEnd"/>
       <w:r>
-        <w:t xml:space="preserve"> particles in a 3D crystal projecting multiple dynamic full-</w:t>
-      </w:r>
-      <w:proofErr w:type="spellStart"/>
-      <w:r>
-        <w:t>color</w:t>
-      </w:r>
-      <w:proofErr w:type="spellEnd"/>
-      <w:r>
-        <w:t xml:space="preserve"> images’, ACM SIGGRAPH 2017 Posters, 73, Los Angeles, USA (07/2017).</w:t>
-      </w:r>
-    </w:p>
-    <w:p>
-      <w:pPr>
-        <w:pStyle w:val="ListParagraph"/>
-      </w:pPr>
-      <w:r>
-        <w:rPr>
-          <w:b/>
-        </w:rPr>
-        <w:t>R. Hirayama</w:t>
-      </w:r>
-      <w:r>
-        <w:t xml:space="preserve">, T. Suzuki, T. </w:t>
-      </w:r>
-      <w:proofErr w:type="spellStart"/>
-      <w:r>
-        <w:t>Shimobaba</w:t>
-      </w:r>
-      <w:proofErr w:type="spellEnd"/>
-      <w:r>
-        <w:t xml:space="preserve">, A. Shiraki, M. Naruse, H. Nakayama, T. </w:t>
-      </w:r>
-      <w:proofErr w:type="spellStart"/>
-      <w:r>
-        <w:t>Kakue</w:t>
-      </w:r>
-      <w:proofErr w:type="spellEnd"/>
-      <w:r>
-        <w:t>,</w:t>
-      </w:r>
-      <w:r>
-        <w:t xml:space="preserve"> and T. Ito, ‘Inkjet-printed 3D structure projecting multiple full-</w:t>
-      </w:r>
-      <w:proofErr w:type="spellStart"/>
-      <w:r>
-        <w:t>color</w:t>
-      </w:r>
-      <w:proofErr w:type="spellEnd"/>
-      <w:r>
         <w:t xml:space="preserve"> images’, OPIC IP2017, IP-20AM-1-5, Yokohama, Japan (04/2017).</w:t>
       </w:r>
     </w:p>
@@ -4602,7 +4692,6 @@
         <w:pStyle w:val="ListParagraph"/>
       </w:pPr>
       <w:r>
-        <w:lastRenderedPageBreak/>
         <w:t xml:space="preserve">F. Kawashima, </w:t>
       </w:r>
       <w:r>
@@ -5227,14 +5316,7 @@
           <w:b/>
           <w:bCs w:val="0"/>
         </w:rPr>
-        <w:t>R.</w:t>
-      </w:r>
-      <w:r>
-        <w:rPr>
-          <w:b/>
-          <w:bCs w:val="0"/>
-        </w:rPr>
-        <w:t xml:space="preserve"> Hirayama</w:t>
+        <w:t>R. Hirayama</w:t>
       </w:r>
       <w:r>
         <w:t>, ‘Acoustic Contactless Food Delivery and Processing’, Keynote Speech at Culinary Action! On The Road (02/2025).</w:t>
@@ -5253,14 +5335,7 @@
           <w:b/>
           <w:bCs w:val="0"/>
         </w:rPr>
-        <w:t>R.</w:t>
-      </w:r>
-      <w:r>
-        <w:rPr>
-          <w:b/>
-          <w:bCs w:val="0"/>
-        </w:rPr>
-        <w:t xml:space="preserve"> Hirayama</w:t>
+        <w:t>R. Hirayama</w:t>
       </w:r>
       <w:r>
         <w:t>, ‘Acoustic Levitation for Displays and Fabrication’, Talk at the High-Beams Seminar series (11/2024).</w:t>
@@ -5279,29 +5354,10 @@
           <w:b/>
           <w:bCs w:val="0"/>
         </w:rPr>
-        <w:t>R.</w:t>
-      </w:r>
-      <w:r>
-        <w:rPr>
-          <w:b/>
-          <w:bCs w:val="0"/>
-        </w:rPr>
-        <w:t xml:space="preserve"> Hirayama</w:t>
-      </w:r>
-      <w:r>
-        <w:t xml:space="preserve">, </w:t>
-      </w:r>
-      <w:r>
-        <w:t>D. M.</w:t>
-      </w:r>
-      <w:r>
-        <w:t xml:space="preserve"> Plasencia, and S</w:t>
-      </w:r>
-      <w:r>
-        <w:t>.</w:t>
-      </w:r>
-      <w:r>
-        <w:t xml:space="preserve"> Subramanian, ‘</w:t>
+        <w:t>R. Hirayama</w:t>
+      </w:r>
+      <w:r>
+        <w:t>, D. M. Plasencia, and S. Subramanian, ‘</w:t>
       </w:r>
       <w:proofErr w:type="spellStart"/>
       <w:r>
@@ -5509,6 +5565,7 @@
         <w:pStyle w:val="Heading1"/>
       </w:pPr>
       <w:r>
+        <w:lastRenderedPageBreak/>
         <w:t>Patents</w:t>
       </w:r>
     </w:p>
@@ -5776,7 +5833,6 @@
         <w:rPr>
           <w:bCs w:val="0"/>
         </w:rPr>
-        <w:lastRenderedPageBreak/>
         <w:t xml:space="preserve">T. </w:t>
       </w:r>
       <w:proofErr w:type="spellStart"/>
@@ -7733,6 +7789,7 @@
           <w:rFonts w:eastAsia="MS Mincho"/>
           <w:b/>
         </w:rPr>
+        <w:lastRenderedPageBreak/>
         <w:t>Dagens Nyheter</w:t>
       </w:r>
       <w:r>
@@ -8156,7 +8213,6 @@
         <w:rPr>
           <w:b/>
         </w:rPr>
-        <w:lastRenderedPageBreak/>
         <w:t>OSA Publishing, Image of</w:t>
       </w:r>
       <w:r>
@@ -11261,6 +11317,7 @@
   <w:style w:type="character" w:default="1" w:styleId="DefaultParagraphFont">
     <w:name w:val="Default Paragraph Font"/>
     <w:uiPriority w:val="1"/>
+    <w:semiHidden/>
     <w:unhideWhenUsed/>
   </w:style>
   <w:style w:type="table" w:default="1" w:styleId="TableNormal">

</xml_diff>